<commit_message>
Add cycle 2 log and Astah diagram
</commit_message>
<xml_diff>
--- a/documentacion/Bitacora.docx
+++ b/documentacion/Bitacora.docx
@@ -6,42 +6,76 @@
       <w:pPr>
         <w:spacing w:before="240" w:after="240"/>
         <w:rPr>
-          <w:rFonts w:ascii="Aptos" w:eastAsia="Aptos" w:hAnsi="Aptos" w:cs="Aptos"/>
-          <w:b/>
-          <w:bCs/>
-        </w:rPr>
-      </w:pPr>
-      <w:r>
-        <w:rPr>
-          <w:rFonts w:ascii="Aptos" w:eastAsia="Aptos" w:hAnsi="Aptos" w:cs="Aptos"/>
-          <w:b/>
-          <w:bCs/>
-        </w:rPr>
-        <w:t>RUBEN FELIPE BUSTOS CARABANTE – JUAN DIEGO ZORRO GONZALEZ</w:t>
-      </w:r>
-    </w:p>
-    <w:p>
-      <w:pPr>
-        <w:spacing w:before="240" w:after="240"/>
-      </w:pPr>
-      <w:r>
-        <w:rPr>
-          <w:rFonts w:ascii="Aptos" w:eastAsia="Aptos" w:hAnsi="Aptos" w:cs="Aptos"/>
-          <w:b/>
-          <w:bCs/>
-        </w:rPr>
-        <w:t>1. ¿Cuáles fueron los mini-ciclos definidos? Justifíquenlos.</w:t>
-      </w:r>
-    </w:p>
-    <w:p>
-      <w:pPr>
-        <w:spacing w:before="240" w:after="240"/>
-      </w:pPr>
-      <w:r>
-        <w:rPr>
-          <w:rFonts w:ascii="Aptos" w:eastAsia="Aptos" w:hAnsi="Aptos" w:cs="Aptos"/>
-        </w:rPr>
-        <w:t xml:space="preserve">El proyecto se divido en seis mini-ciclos, yendo de las clases más independientes a las más dependientes, la idea era que cada ciclo compilara por sí solo: </w:t>
+          <w:b/>
+          <w:bCs/>
+          <w:color w:val="000000" w:themeColor="text1"/>
+          <w:lang w:val="es-MX"/>
+        </w:rPr>
+      </w:pPr>
+      <w:r>
+        <w:rPr>
+          <w:b/>
+          <w:bCs/>
+          <w:color w:val="000000" w:themeColor="text1"/>
+          <w:lang w:val="es-MX"/>
+        </w:rPr>
+        <w:t>Ciclo 2:</w:t>
+      </w:r>
+    </w:p>
+    <w:p>
+      <w:pPr>
+        <w:spacing w:before="240" w:after="240"/>
+        <w:rPr>
+          <w:rFonts w:ascii="Aptos" w:eastAsia="Aptos" w:hAnsi="Aptos" w:cs="Aptos"/>
+          <w:b/>
+          <w:bCs/>
+          <w:color w:val="000000" w:themeColor="text1"/>
+        </w:rPr>
+      </w:pPr>
+      <w:r>
+        <w:rPr>
+          <w:rFonts w:ascii="Aptos" w:eastAsia="Aptos" w:hAnsi="Aptos" w:cs="Aptos"/>
+          <w:b/>
+          <w:bCs/>
+          <w:color w:val="000000" w:themeColor="text1"/>
+        </w:rPr>
+        <w:t xml:space="preserve">1. ¿Cuáles fueron los </w:t>
+      </w:r>
+      <w:proofErr w:type="spellStart"/>
+      <w:r>
+        <w:rPr>
+          <w:rFonts w:ascii="Aptos" w:eastAsia="Aptos" w:hAnsi="Aptos" w:cs="Aptos"/>
+          <w:b/>
+          <w:bCs/>
+          <w:color w:val="000000" w:themeColor="text1"/>
+        </w:rPr>
+        <w:t>mini-ciclos</w:t>
+      </w:r>
+      <w:proofErr w:type="spellEnd"/>
+      <w:r>
+        <w:rPr>
+          <w:rFonts w:ascii="Aptos" w:eastAsia="Aptos" w:hAnsi="Aptos" w:cs="Aptos"/>
+          <w:b/>
+          <w:bCs/>
+          <w:color w:val="000000" w:themeColor="text1"/>
+        </w:rPr>
+        <w:t xml:space="preserve"> definidos? Justifíquenlos.</w:t>
+      </w:r>
+    </w:p>
+    <w:p>
+      <w:pPr>
+        <w:spacing w:before="240" w:after="240"/>
+        <w:rPr>
+          <w:rFonts w:ascii="Aptos" w:eastAsia="Aptos" w:hAnsi="Aptos" w:cs="Aptos"/>
+          <w:color w:val="000000" w:themeColor="text1"/>
+        </w:rPr>
+      </w:pPr>
+      <w:r>
+        <w:rPr>
+          <w:rFonts w:ascii="Aptos" w:eastAsia="Aptos" w:hAnsi="Aptos" w:cs="Aptos"/>
+          <w:color w:val="000000" w:themeColor="text1"/>
+        </w:rPr>
+        <w:t>El proyecto se dividió en cinco mini-ciclos, organizados por orden de dependencia funcional, yendo de la base estructural (el refactor) a las funcionalidades más complejas. La idea era que cada mini-ciclo se apoyara en el anterior y validara un requisito específico antes de pasar al siguiente:</w:t>
       </w:r>
     </w:p>
     <w:p>
@@ -51,16 +85,15 @@
           <w:ilvl w:val="0"/>
           <w:numId w:val="1"/>
         </w:numPr>
-        <w:spacing w:before="240" w:after="240"/>
-        <w:rPr>
-          <w:rFonts w:ascii="Aptos" w:eastAsia="Aptos" w:hAnsi="Aptos" w:cs="Aptos"/>
-        </w:rPr>
-      </w:pPr>
-      <w:r>
-        <w:rPr>
-          <w:rFonts w:ascii="Aptos" w:eastAsia="Aptos" w:hAnsi="Aptos" w:cs="Aptos"/>
-        </w:rPr>
-        <w:t>Ciclo 1, clase Symbol (el símbolo visual que solo depende de Circle de shapes)</w:t>
+        <w:rPr>
+          <w:color w:val="000000" w:themeColor="text1"/>
+        </w:rPr>
+      </w:pPr>
+      <w:r>
+        <w:rPr>
+          <w:color w:val="000000" w:themeColor="text1"/>
+        </w:rPr>
+        <w:t>Mini-ciclo 1, Refactoring del catálogo compartido (mover el catálogo de SlotMachine a Wheel).</w:t>
       </w:r>
     </w:p>
     <w:p>
@@ -70,16 +103,15 @@
           <w:ilvl w:val="0"/>
           <w:numId w:val="1"/>
         </w:numPr>
-        <w:spacing w:before="240" w:after="240"/>
-        <w:rPr>
-          <w:rFonts w:ascii="Aptos" w:eastAsia="Aptos" w:hAnsi="Aptos" w:cs="Aptos"/>
-        </w:rPr>
-      </w:pPr>
-      <w:r>
-        <w:rPr>
-          <w:rFonts w:ascii="Aptos" w:eastAsia="Aptos" w:hAnsi="Aptos" w:cs="Aptos"/>
-        </w:rPr>
-        <w:t>Ciclo 2, Wheel en su versión visual básica (cuerpo y ventana en la grilla)</w:t>
+        <w:rPr>
+          <w:color w:val="000000" w:themeColor="text1"/>
+        </w:rPr>
+      </w:pPr>
+      <w:r>
+        <w:rPr>
+          <w:color w:val="000000" w:themeColor="text1"/>
+        </w:rPr>
+        <w:t>Mini-ciclo 2, Bloquear y desbloquear una rueda.</w:t>
       </w:r>
     </w:p>
     <w:p>
@@ -89,16 +121,15 @@
           <w:ilvl w:val="0"/>
           <w:numId w:val="1"/>
         </w:numPr>
-        <w:spacing w:before="240" w:after="240"/>
-        <w:rPr>
-          <w:rFonts w:ascii="Aptos" w:eastAsia="Aptos" w:hAnsi="Aptos" w:cs="Aptos"/>
-        </w:rPr>
-      </w:pPr>
-      <w:r>
-        <w:rPr>
-          <w:rFonts w:ascii="Aptos" w:eastAsia="Aptos" w:hAnsi="Aptos" w:cs="Aptos"/>
-        </w:rPr>
-        <w:t>Ciclo 3, Wheel completa con la lógica de símbolos y giro</w:t>
+        <w:rPr>
+          <w:color w:val="000000" w:themeColor="text1"/>
+        </w:rPr>
+      </w:pPr>
+      <w:r>
+        <w:rPr>
+          <w:color w:val="000000" w:themeColor="text1"/>
+        </w:rPr>
+        <w:t>Mini-ciclo 3, Intercambiar dos ruedas.</w:t>
       </w:r>
     </w:p>
     <w:p>
@@ -108,16 +139,15 @@
           <w:ilvl w:val="0"/>
           <w:numId w:val="1"/>
         </w:numPr>
-        <w:spacing w:before="240" w:after="240"/>
-        <w:rPr>
-          <w:rFonts w:ascii="Aptos" w:eastAsia="Aptos" w:hAnsi="Aptos" w:cs="Aptos"/>
-        </w:rPr>
-      </w:pPr>
-      <w:r>
-        <w:rPr>
-          <w:rFonts w:ascii="Aptos" w:eastAsia="Aptos" w:hAnsi="Aptos" w:cs="Aptos"/>
-        </w:rPr>
-        <w:t>Ciclo 4, SlotMachine con el cuerpo visual y y el manejo de ruedas</w:t>
+        <w:rPr>
+          <w:color w:val="000000" w:themeColor="text1"/>
+        </w:rPr>
+      </w:pPr>
+      <w:r>
+        <w:rPr>
+          <w:color w:val="000000" w:themeColor="text1"/>
+        </w:rPr>
+        <w:t>Mini-ciclo 4, Rotar una rueda un número de pasos.</w:t>
       </w:r>
     </w:p>
     <w:p>
@@ -127,90 +157,45 @@
           <w:ilvl w:val="0"/>
           <w:numId w:val="1"/>
         </w:numPr>
-        <w:spacing w:before="240" w:after="240"/>
-        <w:rPr>
-          <w:rFonts w:ascii="Aptos" w:eastAsia="Aptos" w:hAnsi="Aptos" w:cs="Aptos"/>
-        </w:rPr>
-      </w:pPr>
-      <w:r>
-        <w:rPr>
-          <w:rFonts w:ascii="Aptos" w:eastAsia="Aptos" w:hAnsi="Aptos" w:cs="Aptos"/>
-        </w:rPr>
-        <w:t>Ciclo 5, SlotMachine con símbolos compartidos y la lógica del juego.</w:t>
-      </w:r>
-    </w:p>
-    <w:p>
-      <w:pPr>
-        <w:pStyle w:val="Prrafodelista"/>
-        <w:numPr>
-          <w:ilvl w:val="0"/>
-          <w:numId w:val="1"/>
-        </w:numPr>
-        <w:spacing w:before="240" w:after="240"/>
-        <w:rPr>
-          <w:rFonts w:ascii="Aptos" w:eastAsia="Aptos" w:hAnsi="Aptos" w:cs="Aptos"/>
-        </w:rPr>
-      </w:pPr>
-      <w:r>
-        <w:rPr>
-          <w:rFonts w:ascii="Aptos" w:eastAsia="Aptos" w:hAnsi="Aptos" w:cs="Aptos"/>
-        </w:rPr>
-        <w:t>Ciclo 6, los detalles de usabilidad (animación de la palanca y parpadeo del estado ganador).</w:t>
-      </w:r>
-    </w:p>
-    <w:p>
-      <w:pPr>
-        <w:spacing w:before="240" w:after="240"/>
-        <w:rPr>
-          <w:rFonts w:ascii="Aptos" w:eastAsia="Aptos" w:hAnsi="Aptos" w:cs="Aptos"/>
-        </w:rPr>
-      </w:pPr>
-      <w:r>
-        <w:rPr>
-          <w:rFonts w:ascii="Aptos" w:eastAsia="Aptos" w:hAnsi="Aptos" w:cs="Aptos"/>
-        </w:rPr>
-        <w:t>Decidimos hacerlo de esta manera ya</w:t>
-      </w:r>
-      <w:r>
-        <w:rPr>
-          <w:rFonts w:ascii="Aptos" w:eastAsia="Aptos" w:hAnsi="Aptos" w:cs="Aptos"/>
-        </w:rPr>
-        <w:t xml:space="preserve"> que respeta las dependencias entre clases, o sea SlotMachine usa Wheel y Wheel usa Symbol, construir de abajo hacia arriba permite que cada mini-ciclo termine en un </w:t>
-      </w:r>
-      <w:r>
-        <w:rPr>
-          <w:rFonts w:ascii="Aptos" w:eastAsia="Aptos" w:hAnsi="Aptos" w:cs="Aptos"/>
-        </w:rPr>
-        <w:t>estado que</w:t>
-      </w:r>
-      <w:r>
-        <w:rPr>
-          <w:rFonts w:ascii="Aptos" w:eastAsia="Aptos" w:hAnsi="Aptos" w:cs="Aptos"/>
-        </w:rPr>
-        <w:t xml:space="preserve"> compila y </w:t>
-      </w:r>
-      <w:r>
-        <w:rPr>
-          <w:rFonts w:ascii="Aptos" w:eastAsia="Aptos" w:hAnsi="Aptos" w:cs="Aptos"/>
-        </w:rPr>
-        <w:t>se puede probar</w:t>
-      </w:r>
-      <w:r>
-        <w:rPr>
-          <w:rFonts w:ascii="Aptos" w:eastAsia="Aptos" w:hAnsi="Aptos" w:cs="Aptos"/>
-        </w:rPr>
-        <w:t xml:space="preserve"> en BlueJ.</w:t>
-      </w:r>
-    </w:p>
-    <w:p>
-      <w:pPr>
-        <w:spacing w:before="240" w:after="240"/>
-      </w:pPr>
-      <w:r>
-        <w:rPr>
-          <w:rFonts w:ascii="Aptos" w:eastAsia="Aptos" w:hAnsi="Aptos" w:cs="Aptos"/>
-          <w:b/>
-          <w:bCs/>
+        <w:rPr>
+          <w:color w:val="000000" w:themeColor="text1"/>
+        </w:rPr>
+      </w:pPr>
+      <w:r>
+        <w:rPr>
+          <w:color w:val="000000" w:themeColor="text1"/>
+        </w:rPr>
+        <w:t>Mini-ciclo 5, Dejar la máquina en una configuración dada.</w:t>
+      </w:r>
+    </w:p>
+    <w:p>
+      <w:pPr>
+        <w:rPr>
+          <w:color w:val="000000" w:themeColor="text1"/>
+        </w:rPr>
+      </w:pPr>
+      <w:r>
+        <w:rPr>
+          <w:color w:val="000000" w:themeColor="text1"/>
+        </w:rPr>
+        <w:t>Decidimos hacerlo de esta manera ya que respeta estrictamente las dependencias lógicas entre los nuevos requisitos, primero aseguramos que la refactorización de la base no rompiera lo que ya funcionaba, luego implementamos el bloqueo de ruedas porque es un prerrequisito indispensable para poder intercambiarlas y rotarlas, para finalizar dejamos para el último ciclo la configuración global de la máquina ya que es la más compleja y requiere validar y respetar todos los estados previos como las ruedas bloqueadas y el catálogo individual, en un comportamiento "todo o nada", permitiendo que cada paso termine en un estado estable, probado y listo para construir sobre él.</w:t>
+      </w:r>
+    </w:p>
+    <w:p>
+      <w:pPr>
+        <w:rPr>
+          <w:rFonts w:ascii="Aptos" w:eastAsia="Aptos" w:hAnsi="Aptos" w:cs="Aptos"/>
+          <w:b/>
+          <w:bCs/>
+          <w:color w:val="000000" w:themeColor="text1"/>
+        </w:rPr>
+      </w:pPr>
+      <w:r>
+        <w:rPr>
+          <w:rFonts w:ascii="Aptos" w:eastAsia="Aptos" w:hAnsi="Aptos" w:cs="Aptos"/>
+          <w:b/>
+          <w:bCs/>
+          <w:color w:val="000000" w:themeColor="text1"/>
         </w:rPr>
         <w:t>2. ¿Cuál es el estado actual del proyecto en términos de mini-ciclos?</w:t>
       </w:r>
@@ -220,26 +205,124 @@
         <w:spacing w:before="240" w:after="240"/>
         <w:rPr>
           <w:rFonts w:ascii="system-ui" w:eastAsia="system-ui" w:hAnsi="system-ui" w:cs="system-ui"/>
-          <w:color w:val="222222"/>
+          <w:color w:val="000000" w:themeColor="text1"/>
         </w:rPr>
       </w:pPr>
       <w:r>
         <w:rPr>
           <w:rFonts w:ascii="system-ui" w:eastAsia="system-ui" w:hAnsi="system-ui" w:cs="system-ui"/>
-          <w:color w:val="222222"/>
-        </w:rPr>
-        <w:t>El proyecto ya está en el mini-ciclo 6 (completo): todas las clases están construidas, compilan y y el simulador funciona con símbolos, giro, detección de estado ganador y animaciones, además se construyeron de manera satisfactoria los diagramas de clases y secuencias del proyecto</w:t>
-      </w:r>
-    </w:p>
-    <w:p>
-      <w:pPr>
-        <w:spacing w:before="240" w:after="240"/>
-      </w:pPr>
-      <w:r>
-        <w:rPr>
-          <w:rFonts w:ascii="Aptos" w:eastAsia="Aptos" w:hAnsi="Aptos" w:cs="Aptos"/>
-          <w:b/>
-          <w:bCs/>
+          <w:color w:val="000000" w:themeColor="text1"/>
+        </w:rPr>
+        <w:t xml:space="preserve">El </w:t>
+      </w:r>
+      <w:r>
+        <w:rPr>
+          <w:rFonts w:ascii="system-ui" w:eastAsia="system-ui" w:hAnsi="system-ui" w:cs="system-ui"/>
+          <w:color w:val="000000" w:themeColor="text1"/>
+        </w:rPr>
+        <w:t>estado del ciclo 2 del proyecto se encuentra</w:t>
+      </w:r>
+      <w:r>
+        <w:rPr>
+          <w:rFonts w:ascii="system-ui" w:eastAsia="system-ui" w:hAnsi="system-ui" w:cs="system-ui"/>
+          <w:color w:val="000000" w:themeColor="text1"/>
+        </w:rPr>
+        <w:t xml:space="preserve"> en el mini-ciclo </w:t>
+      </w:r>
+      <w:r>
+        <w:rPr>
+          <w:rFonts w:ascii="system-ui" w:eastAsia="system-ui" w:hAnsi="system-ui" w:cs="system-ui"/>
+          <w:color w:val="000000" w:themeColor="text1"/>
+        </w:rPr>
+        <w:t>5</w:t>
+      </w:r>
+      <w:r>
+        <w:rPr>
+          <w:rFonts w:ascii="system-ui" w:eastAsia="system-ui" w:hAnsi="system-ui" w:cs="system-ui"/>
+          <w:color w:val="000000" w:themeColor="text1"/>
+        </w:rPr>
+        <w:t xml:space="preserve"> (completo): </w:t>
+      </w:r>
+      <w:r>
+        <w:rPr>
+          <w:rFonts w:ascii="system-ui" w:eastAsia="system-ui" w:hAnsi="system-ui" w:cs="system-ui"/>
+          <w:color w:val="000000" w:themeColor="text1"/>
+        </w:rPr>
+        <w:t>L</w:t>
+      </w:r>
+      <w:r>
+        <w:rPr>
+          <w:rFonts w:ascii="system-ui" w:eastAsia="system-ui" w:hAnsi="system-ui" w:cs="system-ui"/>
+          <w:color w:val="000000" w:themeColor="text1"/>
+        </w:rPr>
+        <w:t xml:space="preserve">as clases </w:t>
+      </w:r>
+      <w:r>
+        <w:rPr>
+          <w:rFonts w:ascii="system-ui" w:eastAsia="system-ui" w:hAnsi="system-ui" w:cs="system-ui"/>
+          <w:color w:val="000000" w:themeColor="text1"/>
+        </w:rPr>
+        <w:t>fueron actualizadas</w:t>
+      </w:r>
+      <w:r>
+        <w:rPr>
+          <w:rFonts w:ascii="system-ui" w:eastAsia="system-ui" w:hAnsi="system-ui" w:cs="system-ui"/>
+          <w:color w:val="000000" w:themeColor="text1"/>
+        </w:rPr>
+        <w:t>, compilan y el simulado</w:t>
+      </w:r>
+      <w:r>
+        <w:rPr>
+          <w:rFonts w:ascii="system-ui" w:eastAsia="system-ui" w:hAnsi="system-ui" w:cs="system-ui"/>
+          <w:color w:val="000000" w:themeColor="text1"/>
+        </w:rPr>
+        <w:t>r funciona con la extensión que hicimos durante este ciclo</w:t>
+      </w:r>
+      <w:r>
+        <w:rPr>
+          <w:rFonts w:ascii="system-ui" w:eastAsia="system-ui" w:hAnsi="system-ui" w:cs="system-ui"/>
+          <w:color w:val="000000" w:themeColor="text1"/>
+        </w:rPr>
+        <w:t xml:space="preserve">, además se </w:t>
+      </w:r>
+      <w:r>
+        <w:rPr>
+          <w:rFonts w:ascii="system-ui" w:eastAsia="system-ui" w:hAnsi="system-ui" w:cs="system-ui"/>
+          <w:color w:val="000000" w:themeColor="text1"/>
+        </w:rPr>
+        <w:t xml:space="preserve">actualizaron y </w:t>
+      </w:r>
+      <w:r>
+        <w:rPr>
+          <w:rFonts w:ascii="system-ui" w:eastAsia="system-ui" w:hAnsi="system-ui" w:cs="system-ui"/>
+          <w:color w:val="000000" w:themeColor="text1"/>
+        </w:rPr>
+        <w:t>construyeron de manera satisfactoria los diagramas de clases y secuencias del proyecto</w:t>
+      </w:r>
+      <w:r>
+        <w:rPr>
+          <w:rFonts w:ascii="system-ui" w:eastAsia="system-ui" w:hAnsi="system-ui" w:cs="system-ui"/>
+          <w:color w:val="000000" w:themeColor="text1"/>
+        </w:rPr>
+        <w:t>, también se realizaron las correcciones correspondientes dichas en la retroalimentación del ciclo 1.</w:t>
+      </w:r>
+    </w:p>
+    <w:p>
+      <w:pPr>
+        <w:spacing w:before="240" w:after="240"/>
+        <w:rPr>
+          <w:rFonts w:ascii="Aptos" w:eastAsia="Aptos" w:hAnsi="Aptos" w:cs="Aptos"/>
+          <w:b/>
+          <w:bCs/>
+          <w:color w:val="000000" w:themeColor="text1"/>
+        </w:rPr>
+      </w:pPr>
+      <w:r>
+        <w:rPr>
+          <w:rFonts w:ascii="Aptos" w:eastAsia="Aptos" w:hAnsi="Aptos" w:cs="Aptos"/>
+          <w:b/>
+          <w:bCs/>
+          <w:color w:val="000000" w:themeColor="text1"/>
         </w:rPr>
         <w:t>3. Tiempo total invertido (Horas/Hombre).</w:t>
       </w:r>
@@ -249,30 +332,47 @@
         <w:spacing w:before="240" w:after="240"/>
         <w:rPr>
           <w:rFonts w:ascii="Aptos" w:eastAsia="Aptos" w:hAnsi="Aptos" w:cs="Aptos"/>
-        </w:rPr>
-      </w:pPr>
-      <w:r>
-        <w:rPr>
-          <w:rFonts w:ascii="Aptos" w:eastAsia="Aptos" w:hAnsi="Aptos" w:cs="Aptos"/>
-        </w:rPr>
-        <w:t>Nosotros como equipo tuvimos 16 horas de manera individual cada uno, por su parte cada uno tuvo que afrontar retos y desafios que nos llevaron a reintentar varias veces algunos proc</w:t>
-      </w:r>
-      <w:r>
-        <w:rPr>
-          <w:rFonts w:ascii="Aptos" w:eastAsia="Aptos" w:hAnsi="Aptos" w:cs="Aptos"/>
-        </w:rPr>
-        <w:t>esos causando que se extendiera el tiempo invertido</w:t>
-      </w:r>
-    </w:p>
-    <w:p>
-      <w:pPr>
-        <w:spacing w:before="240" w:after="240"/>
-      </w:pPr>
-      <w:r>
-        <w:rPr>
-          <w:rFonts w:ascii="Aptos" w:eastAsia="Aptos" w:hAnsi="Aptos" w:cs="Aptos"/>
-          <w:b/>
-          <w:bCs/>
+          <w:color w:val="000000" w:themeColor="text1"/>
+        </w:rPr>
+      </w:pPr>
+      <w:r>
+        <w:rPr>
+          <w:rFonts w:ascii="Aptos" w:eastAsia="Aptos" w:hAnsi="Aptos" w:cs="Aptos"/>
+          <w:color w:val="000000" w:themeColor="text1"/>
+        </w:rPr>
+        <w:t xml:space="preserve">Nosotros como equipo tuvimos </w:t>
+      </w:r>
+      <w:r>
+        <w:rPr>
+          <w:rFonts w:ascii="Aptos" w:eastAsia="Aptos" w:hAnsi="Aptos" w:cs="Aptos"/>
+          <w:color w:val="000000" w:themeColor="text1"/>
+        </w:rPr>
+        <w:t>12</w:t>
+      </w:r>
+      <w:r>
+        <w:rPr>
+          <w:rFonts w:ascii="Aptos" w:eastAsia="Aptos" w:hAnsi="Aptos" w:cs="Aptos"/>
+          <w:color w:val="000000" w:themeColor="text1"/>
+        </w:rPr>
+        <w:t xml:space="preserve"> horas de manera individual cada uno, por su parte cada uno tuvo que afrontar retos y desafíos que nos llevaron a reintentar varias veces algunos procesos causando que se extendiera el tiempo invertido</w:t>
+      </w:r>
+    </w:p>
+    <w:p>
+      <w:pPr>
+        <w:spacing w:before="240" w:after="240"/>
+        <w:rPr>
+          <w:rFonts w:ascii="Aptos" w:eastAsia="Aptos" w:hAnsi="Aptos" w:cs="Aptos"/>
+          <w:b/>
+          <w:bCs/>
+          <w:color w:val="000000" w:themeColor="text1"/>
+        </w:rPr>
+      </w:pPr>
+      <w:r>
+        <w:rPr>
+          <w:rFonts w:ascii="Aptos" w:eastAsia="Aptos" w:hAnsi="Aptos" w:cs="Aptos"/>
+          <w:b/>
+          <w:bCs/>
+          <w:color w:val="000000" w:themeColor="text1"/>
         </w:rPr>
         <w:t>4. ¿Cuál consideran el mayor logro?</w:t>
       </w:r>
@@ -280,23 +380,43 @@
     <w:p>
       <w:pPr>
         <w:spacing w:before="240" w:after="240"/>
-      </w:pPr>
-      <w:r>
-        <w:rPr>
-          <w:rFonts w:ascii="Aptos" w:eastAsia="Aptos" w:hAnsi="Aptos" w:cs="Aptos"/>
-        </w:rPr>
-        <w:t>Nosotros como equipo creemos que el mayor logro que conseguimos fue el diseño delegado, la SlotMachine coordina pero delega en cada Wheel el manejo de sus símbolos y su giro, los símbolos son compartidos entre todas las ruedas. Lograr que agregar o quitar un símbolo se propagara a todas las ruedas manteniendo la posición fija de cada símbolo fue el resultado más sólido del diseño</w:t>
-      </w:r>
-    </w:p>
-    <w:p>
-      <w:pPr>
-        <w:spacing w:before="240" w:after="240"/>
-      </w:pPr>
-      <w:r>
-        <w:rPr>
-          <w:rFonts w:ascii="Aptos" w:eastAsia="Aptos" w:hAnsi="Aptos" w:cs="Aptos"/>
-          <w:b/>
-          <w:bCs/>
+        <w:rPr>
+          <w:rFonts w:ascii="Aptos" w:eastAsia="Aptos" w:hAnsi="Aptos" w:cs="Aptos"/>
+          <w:color w:val="000000" w:themeColor="text1"/>
+        </w:rPr>
+      </w:pPr>
+      <w:r>
+        <w:rPr>
+          <w:rFonts w:ascii="Aptos" w:eastAsia="Aptos" w:hAnsi="Aptos" w:cs="Aptos"/>
+          <w:color w:val="000000" w:themeColor="text1"/>
+        </w:rPr>
+        <w:t xml:space="preserve">Nosotros como equipo creemos que el mayor logro que conseguimos fue el diseño delegado, la SlotMachine coordina, pero delega en cada Wheel el manejo de sus </w:t>
+      </w:r>
+      <w:r>
+        <w:rPr>
+          <w:rFonts w:ascii="Aptos" w:eastAsia="Aptos" w:hAnsi="Aptos" w:cs="Aptos"/>
+          <w:color w:val="000000" w:themeColor="text1"/>
+        </w:rPr>
+        <w:lastRenderedPageBreak/>
+        <w:t>símbolos y su giro, los símbolos son compartidos entre todas las ruedas. Lograr que agregar o quitar un símbolo se propagara a todas las ruedas manteniendo la posición fija de cada símbolo fue el resultado más sólido del diseño</w:t>
+      </w:r>
+    </w:p>
+    <w:p>
+      <w:pPr>
+        <w:spacing w:before="240" w:after="240"/>
+        <w:rPr>
+          <w:rFonts w:ascii="Aptos" w:eastAsia="Aptos" w:hAnsi="Aptos" w:cs="Aptos"/>
+          <w:b/>
+          <w:bCs/>
+          <w:color w:val="000000" w:themeColor="text1"/>
+        </w:rPr>
+      </w:pPr>
+      <w:r>
+        <w:rPr>
+          <w:rFonts w:ascii="Aptos" w:eastAsia="Aptos" w:hAnsi="Aptos" w:cs="Aptos"/>
+          <w:b/>
+          <w:bCs/>
+          <w:color w:val="000000" w:themeColor="text1"/>
         </w:rPr>
         <w:t>5. ¿Cuál fue el mayor problema técnico? ¿Cómo lo resolvieron?</w:t>
       </w:r>
@@ -306,223 +426,245 @@
         <w:spacing w:before="240" w:after="240"/>
         <w:rPr>
           <w:rFonts w:ascii="Aptos" w:eastAsia="Aptos" w:hAnsi="Aptos" w:cs="Aptos"/>
-        </w:rPr>
-      </w:pPr>
-      <w:r>
-        <w:rPr>
-          <w:rFonts w:ascii="Aptos" w:eastAsia="Aptos" w:hAnsi="Aptos" w:cs="Aptos"/>
-        </w:rPr>
-        <w:lastRenderedPageBreak/>
-        <w:t>E</w:t>
-      </w:r>
-      <w:r>
-        <w:rPr>
-          <w:rFonts w:ascii="Aptos" w:eastAsia="Aptos" w:hAnsi="Aptos" w:cs="Aptos"/>
-        </w:rPr>
-        <w:t>l manejo de las posiciones fijas de los símbolos con huecos</w:t>
-      </w:r>
-      <w:r>
-        <w:rPr>
-          <w:rFonts w:ascii="Aptos" w:eastAsia="Aptos" w:hAnsi="Aptos" w:cs="Aptos"/>
-        </w:rPr>
-        <w:t xml:space="preserve"> a</w:t>
-      </w:r>
-      <w:r>
-        <w:rPr>
-          <w:rFonts w:ascii="Aptos" w:eastAsia="Aptos" w:hAnsi="Aptos" w:cs="Aptos"/>
-        </w:rPr>
-        <w:t>l permitir que un símbolo quedara en una ranura fija dejando ranuras vacías, el giro debía saltar solo entre ranuras ocupadas y varios métodos podían fallar con valores nulos</w:t>
-      </w:r>
-      <w:r>
-        <w:rPr>
-          <w:rFonts w:ascii="Aptos" w:eastAsia="Aptos" w:hAnsi="Aptos" w:cs="Aptos"/>
-        </w:rPr>
-        <w:t>, lo</w:t>
-      </w:r>
-      <w:r>
-        <w:rPr>
-          <w:rFonts w:ascii="Aptos" w:eastAsia="Aptos" w:hAnsi="Aptos" w:cs="Aptos"/>
-        </w:rPr>
-        <w:t xml:space="preserve"> resolvi</w:t>
-      </w:r>
-      <w:r>
-        <w:rPr>
-          <w:rFonts w:ascii="Aptos" w:eastAsia="Aptos" w:hAnsi="Aptos" w:cs="Aptos"/>
+          <w:color w:val="000000" w:themeColor="text1"/>
+        </w:rPr>
+      </w:pPr>
+      <w:r>
+        <w:rPr>
+          <w:rFonts w:ascii="Aptos" w:eastAsia="Aptos" w:hAnsi="Aptos" w:cs="Aptos"/>
+          <w:color w:val="000000" w:themeColor="text1"/>
+        </w:rPr>
+        <w:t>El manejo de las posiciones fijas de los símbolos con huecos al permitir que un símbolo quedara en una ranura fija dejando ranuras vacías, el giro debía saltar solo entre ranuras ocupadas y varios métodos podían fallar con valores nulos, lo resolvimos usando un índice de "siguiente ocupada" para el giro, y haciendo que los métodos de consulta (</w:t>
+      </w:r>
+      <w:r>
+        <w:rPr>
+          <w:rFonts w:ascii="Consolas" w:eastAsia="Consolas" w:hAnsi="Consolas" w:cs="Consolas"/>
+          <w:color w:val="000000" w:themeColor="text1"/>
+        </w:rPr>
+        <w:t>contains</w:t>
+      </w:r>
+      <w:r>
+        <w:rPr>
+          <w:rFonts w:ascii="Aptos" w:eastAsia="Aptos" w:hAnsi="Aptos" w:cs="Aptos"/>
+          <w:color w:val="000000" w:themeColor="text1"/>
+        </w:rPr>
+        <w:t xml:space="preserve">, </w:t>
+      </w:r>
+      <w:r>
+        <w:rPr>
+          <w:rFonts w:ascii="Consolas" w:eastAsia="Consolas" w:hAnsi="Consolas" w:cs="Consolas"/>
+          <w:color w:val="000000" w:themeColor="text1"/>
+        </w:rPr>
+        <w:t>distinctSymbols</w:t>
+      </w:r>
+      <w:r>
+        <w:rPr>
+          <w:rFonts w:ascii="Aptos" w:eastAsia="Aptos" w:hAnsi="Aptos" w:cs="Aptos"/>
+          <w:color w:val="000000" w:themeColor="text1"/>
+        </w:rPr>
+        <w:t>, el redibujado) ignoraran las ranuras vacías.</w:t>
+      </w:r>
+    </w:p>
+    <w:p>
+      <w:pPr>
+        <w:spacing w:before="240" w:after="240"/>
+        <w:rPr>
+          <w:rFonts w:ascii="Aptos" w:eastAsia="Aptos" w:hAnsi="Aptos" w:cs="Aptos"/>
+          <w:b/>
+          <w:bCs/>
+          <w:color w:val="000000" w:themeColor="text1"/>
+        </w:rPr>
+      </w:pPr>
+      <w:r>
+        <w:rPr>
+          <w:rFonts w:ascii="Aptos" w:eastAsia="Aptos" w:hAnsi="Aptos" w:cs="Aptos"/>
+          <w:b/>
+          <w:bCs/>
+          <w:color w:val="000000" w:themeColor="text1"/>
+        </w:rPr>
+        <w:t>6. ¿Qué hicieron bien como equipo? ¿Qué se comprometen a mejorar?</w:t>
+      </w:r>
+    </w:p>
+    <w:p>
+      <w:pPr>
+        <w:spacing w:before="240" w:after="240"/>
+        <w:rPr>
+          <w:rFonts w:ascii="Aptos" w:eastAsia="Aptos" w:hAnsi="Aptos" w:cs="Aptos"/>
+          <w:color w:val="000000" w:themeColor="text1"/>
+        </w:rPr>
+      </w:pPr>
+      <w:r>
+        <w:rPr>
+          <w:rFonts w:ascii="Aptos" w:eastAsia="Aptos" w:hAnsi="Aptos" w:cs="Aptos"/>
+          <w:color w:val="000000" w:themeColor="text1"/>
+        </w:rPr>
+        <w:t>Como equipo nos mantuvimos en comunicación,</w:t>
+      </w:r>
+      <w:r>
+        <w:rPr>
+          <w:rFonts w:ascii="Aptos" w:eastAsia="Aptos" w:hAnsi="Aptos" w:cs="Aptos"/>
+          <w:color w:val="000000" w:themeColor="text1"/>
+        </w:rPr>
+        <w:t xml:space="preserve"> buscamos como corregir cosas que se nos pidió dentro de la retroalimentación</w:t>
+      </w:r>
+      <w:r>
+        <w:rPr>
+          <w:rFonts w:ascii="Aptos" w:eastAsia="Aptos" w:hAnsi="Aptos" w:cs="Aptos"/>
+          <w:color w:val="000000" w:themeColor="text1"/>
+        </w:rPr>
+        <w:t>, revisamos a fondo y rehici</w:t>
+      </w:r>
+      <w:r>
+        <w:rPr>
+          <w:rFonts w:ascii="Aptos" w:eastAsia="Aptos" w:hAnsi="Aptos" w:cs="Aptos"/>
+          <w:color w:val="000000" w:themeColor="text1"/>
         </w:rPr>
         <w:t>mos</w:t>
       </w:r>
       <w:r>
         <w:rPr>
           <w:rFonts w:ascii="Aptos" w:eastAsia="Aptos" w:hAnsi="Aptos" w:cs="Aptos"/>
-        </w:rPr>
-        <w:t xml:space="preserve"> usando un índice de "siguiente ocupada" para el giro, y haciendo que los métodos de consulta (</w:t>
-      </w:r>
-      <w:r>
-        <w:rPr>
-          <w:rFonts w:ascii="Consolas" w:eastAsia="Consolas" w:hAnsi="Consolas" w:cs="Consolas"/>
-        </w:rPr>
-        <w:t>contains</w:t>
-      </w:r>
-      <w:r>
-        <w:rPr>
-          <w:rFonts w:ascii="Aptos" w:eastAsia="Aptos" w:hAnsi="Aptos" w:cs="Aptos"/>
-        </w:rPr>
-        <w:t xml:space="preserve">, </w:t>
-      </w:r>
-      <w:r>
-        <w:rPr>
-          <w:rFonts w:ascii="Consolas" w:eastAsia="Consolas" w:hAnsi="Consolas" w:cs="Consolas"/>
-        </w:rPr>
-        <w:t>distinctSymbols</w:t>
-      </w:r>
-      <w:r>
-        <w:rPr>
-          <w:rFonts w:ascii="Aptos" w:eastAsia="Aptos" w:hAnsi="Aptos" w:cs="Aptos"/>
-        </w:rPr>
-        <w:t>, el redibujado) ignoraran las ranuras vacías.</w:t>
-      </w:r>
-    </w:p>
-    <w:p>
-      <w:pPr>
-        <w:spacing w:before="240" w:after="240"/>
-      </w:pPr>
-      <w:r>
-        <w:rPr>
-          <w:rFonts w:ascii="Aptos" w:eastAsia="Aptos" w:hAnsi="Aptos" w:cs="Aptos"/>
-          <w:b/>
-          <w:bCs/>
-        </w:rPr>
-        <w:t>6. ¿Qué hicieron bien como equipo? ¿Qué se comprometen a mejorar?</w:t>
-      </w:r>
-    </w:p>
-    <w:p>
-      <w:pPr>
-        <w:spacing w:before="240" w:after="240"/>
-      </w:pPr>
-      <w:r>
-        <w:rPr>
-          <w:rFonts w:ascii="Aptos" w:eastAsia="Aptos" w:hAnsi="Aptos" w:cs="Aptos"/>
-        </w:rPr>
-        <w:t xml:space="preserve">Como equipo nos mantuvimos </w:t>
-      </w:r>
-      <w:r>
-        <w:rPr>
-          <w:rFonts w:ascii="Aptos" w:eastAsia="Aptos" w:hAnsi="Aptos" w:cs="Aptos"/>
-        </w:rPr>
-        <w:t>en comunicación,</w:t>
-      </w:r>
-      <w:r>
-        <w:rPr>
-          <w:rFonts w:ascii="Aptos" w:eastAsia="Aptos" w:hAnsi="Aptos" w:cs="Aptos"/>
-        </w:rPr>
-        <w:t xml:space="preserve"> buscamos e</w:t>
-      </w:r>
-      <w:r>
-        <w:rPr>
-          <w:rFonts w:ascii="Aptos" w:eastAsia="Aptos" w:hAnsi="Aptos" w:cs="Aptos"/>
-        </w:rPr>
-        <w:t>n primera instancia crear el</w:t>
-      </w:r>
-      <w:r>
-        <w:rPr>
-          <w:rFonts w:ascii="Aptos" w:eastAsia="Aptos" w:hAnsi="Aptos" w:cs="Aptos"/>
-        </w:rPr>
-        <w:t xml:space="preserve"> repositorio, documentar </w:t>
-      </w:r>
-      <w:r>
-        <w:rPr>
-          <w:rFonts w:ascii="Aptos" w:eastAsia="Aptos" w:hAnsi="Aptos" w:cs="Aptos"/>
-        </w:rPr>
-        <w:t>el</w:t>
-      </w:r>
-      <w:r>
-        <w:rPr>
-          <w:rFonts w:ascii="Aptos" w:eastAsia="Aptos" w:hAnsi="Aptos" w:cs="Aptos"/>
+          <w:color w:val="000000" w:themeColor="text1"/>
+        </w:rPr>
+        <w:t xml:space="preserve"> algunas cosas</w:t>
+      </w:r>
+      <w:r>
+        <w:rPr>
+          <w:rFonts w:ascii="Aptos" w:eastAsia="Aptos" w:hAnsi="Aptos" w:cs="Aptos"/>
+          <w:color w:val="000000" w:themeColor="text1"/>
+        </w:rPr>
+        <w:t xml:space="preserve"> que si o si debíamos cambiar con la implementación del ciclo 2</w:t>
+      </w:r>
+      <w:r>
+        <w:rPr>
+          <w:rFonts w:ascii="Aptos" w:eastAsia="Aptos" w:hAnsi="Aptos" w:cs="Aptos"/>
+          <w:color w:val="000000" w:themeColor="text1"/>
+        </w:rPr>
+        <w:t>. Como equipo nuestro compromiso es</w:t>
+      </w:r>
+      <w:r>
+        <w:rPr>
+          <w:rFonts w:ascii="Aptos" w:eastAsia="Aptos" w:hAnsi="Aptos" w:cs="Aptos"/>
+          <w:color w:val="000000" w:themeColor="text1"/>
+        </w:rPr>
+        <w:t xml:space="preserve"> optimizar el tiempo que invertimos para hacer el proyecto debido a que en muchos aspectos pudimos optimizarlo, pero por ciertas cuestiones no se logró.</w:t>
+      </w:r>
+    </w:p>
+    <w:p>
+      <w:pPr>
+        <w:spacing w:before="240" w:after="240"/>
+        <w:rPr>
+          <w:rFonts w:ascii="Aptos" w:eastAsia="Aptos" w:hAnsi="Aptos" w:cs="Aptos"/>
+          <w:b/>
+          <w:bCs/>
+          <w:color w:val="000000" w:themeColor="text1"/>
+        </w:rPr>
+      </w:pPr>
+      <w:r>
+        <w:rPr>
+          <w:rFonts w:ascii="Aptos" w:eastAsia="Aptos" w:hAnsi="Aptos" w:cs="Aptos"/>
+          <w:b/>
+          <w:bCs/>
+          <w:color w:val="000000" w:themeColor="text1"/>
+        </w:rPr>
+        <w:t>7. Práctica XP más útil.</w:t>
+      </w:r>
+    </w:p>
+    <w:p>
+      <w:pPr>
+        <w:spacing w:before="240" w:after="240"/>
+        <w:rPr>
+          <w:rFonts w:ascii="Aptos" w:eastAsia="Aptos" w:hAnsi="Aptos" w:cs="Aptos"/>
+          <w:color w:val="000000" w:themeColor="text1"/>
+        </w:rPr>
+      </w:pPr>
+      <w:r>
+        <w:rPr>
+          <w:rFonts w:ascii="Aptos" w:eastAsia="Aptos" w:hAnsi="Aptos" w:cs="Aptos"/>
+          <w:color w:val="000000" w:themeColor="text1"/>
+        </w:rPr>
+        <w:t>Creemos que la práctica XP que nos resultó más útil fue</w:t>
+      </w:r>
+      <w:r>
+        <w:rPr>
+          <w:rFonts w:ascii="Aptos" w:eastAsia="Aptos" w:hAnsi="Aptos" w:cs="Aptos"/>
+          <w:color w:val="000000" w:themeColor="text1"/>
+        </w:rPr>
+        <w:t xml:space="preserve"> el Desarrollo Guiado por Pruebas (TDD)</w:t>
+      </w:r>
+      <w:r>
+        <w:rPr>
+          <w:rFonts w:ascii="Aptos" w:eastAsia="Aptos" w:hAnsi="Aptos" w:cs="Aptos"/>
+          <w:color w:val="000000" w:themeColor="text1"/>
+        </w:rPr>
+        <w:t>,</w:t>
+      </w:r>
+      <w:r>
+        <w:rPr>
+          <w:rFonts w:ascii="Aptos" w:eastAsia="Aptos" w:hAnsi="Aptos" w:cs="Aptos"/>
+          <w:color w:val="000000" w:themeColor="text1"/>
+        </w:rPr>
+        <w:t xml:space="preserve"> ya que cada mini-ciclo necesitaba de casos de prueba para verificar que el código implementado funcionara correctamente, sin romper lo anteriormente hecho, sabiendo que todo funcionaba correctamente, nosotros</w:t>
+      </w:r>
+      <w:r>
+        <w:rPr>
+          <w:rFonts w:ascii="Aptos" w:eastAsia="Aptos" w:hAnsi="Aptos" w:cs="Aptos"/>
+          <w:color w:val="000000" w:themeColor="text1"/>
+        </w:rPr>
+        <w:t xml:space="preserve"> procediamos a implementar</w:t>
+      </w:r>
+      <w:r>
+        <w:rPr>
+          <w:rFonts w:ascii="Aptos" w:eastAsia="Aptos" w:hAnsi="Aptos" w:cs="Aptos"/>
+          <w:color w:val="000000" w:themeColor="text1"/>
         </w:rPr>
         <w:t xml:space="preserve"> </w:t>
       </w:r>
       <w:r>
         <w:rPr>
           <w:rFonts w:ascii="Aptos" w:eastAsia="Aptos" w:hAnsi="Aptos" w:cs="Aptos"/>
-        </w:rPr>
-        <w:t>proceso, revisamos</w:t>
-      </w:r>
-      <w:r>
-        <w:rPr>
-          <w:rFonts w:ascii="Aptos" w:eastAsia="Aptos" w:hAnsi="Aptos" w:cs="Aptos"/>
-        </w:rPr>
-        <w:t xml:space="preserve"> a fondo y rehicieron </w:t>
-      </w:r>
-      <w:r>
-        <w:rPr>
-          <w:rFonts w:ascii="Aptos" w:eastAsia="Aptos" w:hAnsi="Aptos" w:cs="Aptos"/>
-        </w:rPr>
-        <w:t>algunas cosas</w:t>
-      </w:r>
-      <w:r>
-        <w:rPr>
-          <w:rFonts w:ascii="Aptos" w:eastAsia="Aptos" w:hAnsi="Aptos" w:cs="Aptos"/>
-        </w:rPr>
-        <w:t>. Como equipo nuestro compromiso es tener una mejor planeación de lo que haremos, paso a paso con el fin de evitar errores que produzcan tener que rehacer alguna pieza del proyecto</w:t>
-      </w:r>
-    </w:p>
-    <w:p>
-      <w:pPr>
-        <w:spacing w:before="240" w:after="240"/>
-      </w:pPr>
-      <w:r>
-        <w:rPr>
-          <w:rFonts w:ascii="Aptos" w:eastAsia="Aptos" w:hAnsi="Aptos" w:cs="Aptos"/>
-          <w:b/>
-          <w:bCs/>
-        </w:rPr>
-        <w:t>7. Práctica XP más útil.</w:t>
-      </w:r>
-    </w:p>
-    <w:p>
-      <w:pPr>
-        <w:spacing w:before="240" w:after="240"/>
-      </w:pPr>
-      <w:r>
-        <w:rPr>
-          <w:rFonts w:ascii="Aptos" w:eastAsia="Aptos" w:hAnsi="Aptos" w:cs="Aptos"/>
-        </w:rPr>
-        <w:t>Creemos que la práctica XP que nos resultó más útil fue la integración continua</w:t>
-      </w:r>
-      <w:r>
-        <w:rPr>
-          <w:rFonts w:ascii="Aptos" w:eastAsia="Aptos" w:hAnsi="Aptos" w:cs="Aptos"/>
-        </w:rPr>
-        <w:t>,</w:t>
-      </w:r>
-      <w:r>
-        <w:rPr>
-          <w:rFonts w:ascii="Aptos" w:eastAsia="Aptos" w:hAnsi="Aptos" w:cs="Aptos"/>
-        </w:rPr>
-        <w:t xml:space="preserve"> compartir y unir el código con frecuencia desde el principio, en vez de que uno avanzara en el diseño y el otro en la implementación por separado</w:t>
-      </w:r>
-      <w:r>
-        <w:rPr>
-          <w:rFonts w:ascii="Aptos" w:eastAsia="Aptos" w:hAnsi="Aptos" w:cs="Aptos"/>
-        </w:rPr>
-        <w:t xml:space="preserve"> nos ahorró bastante tiempo a comparación de hacerlo por separado</w:t>
-      </w:r>
-      <w:r>
-        <w:rPr>
-          <w:rFonts w:ascii="Aptos" w:eastAsia="Aptos" w:hAnsi="Aptos" w:cs="Aptos"/>
-        </w:rPr>
-        <w:t>, debido a que si lo hacíamos por separado probablemente generaría discordancias entre el código y el diseño causando que alguna de las 2 partes tuviera que volver a empezar</w:t>
-      </w:r>
-    </w:p>
-    <w:p>
-      <w:pPr>
-        <w:spacing w:before="240" w:after="240"/>
-      </w:pPr>
-      <w:r>
-        <w:rPr>
-          <w:rFonts w:ascii="Aptos" w:eastAsia="Aptos" w:hAnsi="Aptos" w:cs="Aptos"/>
-          <w:b/>
-          <w:bCs/>
+          <w:color w:val="000000" w:themeColor="text1"/>
+        </w:rPr>
+        <w:t>e</w:t>
+      </w:r>
+      <w:r>
+        <w:rPr>
+          <w:rFonts w:ascii="Aptos" w:eastAsia="Aptos" w:hAnsi="Aptos" w:cs="Aptos"/>
+          <w:color w:val="000000" w:themeColor="text1"/>
+        </w:rPr>
+        <w:t>l siguiente mini-cicl</w:t>
+      </w:r>
+      <w:r>
+        <w:rPr>
+          <w:rFonts w:ascii="Aptos" w:eastAsia="Aptos" w:hAnsi="Aptos" w:cs="Aptos"/>
+          <w:color w:val="000000" w:themeColor="text1"/>
+        </w:rPr>
+        <w:t>o</w:t>
+      </w:r>
+      <w:r>
+        <w:rPr>
+          <w:rFonts w:ascii="Aptos" w:eastAsia="Aptos" w:hAnsi="Aptos" w:cs="Aptos"/>
+          <w:color w:val="000000" w:themeColor="text1"/>
+        </w:rPr>
+        <w:t>, en el caso contrario de que las pruebas fallaran, se indagaba la fuente del error, se refactorizaba el codigo y se volvia a probar.</w:t>
+      </w:r>
+    </w:p>
+    <w:p>
+      <w:pPr>
+        <w:spacing w:before="240" w:after="240"/>
+        <w:rPr>
+          <w:rFonts w:ascii="Aptos" w:eastAsia="Aptos" w:hAnsi="Aptos" w:cs="Aptos"/>
+          <w:b/>
+          <w:bCs/>
+          <w:color w:val="000000" w:themeColor="text1"/>
+        </w:rPr>
+      </w:pPr>
+      <w:r>
+        <w:rPr>
+          <w:rFonts w:ascii="Aptos" w:eastAsia="Aptos" w:hAnsi="Aptos" w:cs="Aptos"/>
+          <w:b/>
+          <w:bCs/>
+          <w:color w:val="000000" w:themeColor="text1"/>
         </w:rPr>
         <w:t>8. Referencias.</w:t>
       </w:r>
@@ -530,11 +672,15 @@
     <w:p>
       <w:pPr>
         <w:spacing w:before="240" w:after="240"/>
-      </w:pPr>
-      <w:r>
-        <w:rPr>
-          <w:rFonts w:ascii="Aptos" w:eastAsia="Aptos" w:hAnsi="Aptos" w:cs="Aptos"/>
-          <w:lang w:val="en-US"/>
+        <w:rPr>
+          <w:color w:val="000000" w:themeColor="text1"/>
+        </w:rPr>
+      </w:pPr>
+      <w:r>
+        <w:rPr>
+          <w:rFonts w:ascii="Aptos" w:eastAsia="Aptos" w:hAnsi="Aptos" w:cs="Aptos"/>
+          <w:color w:val="000000" w:themeColor="text1"/>
+          <w:lang w:val="es-MX"/>
         </w:rPr>
         <w:t xml:space="preserve"> Oracle. (s. f.). </w:t>
       </w:r>
@@ -543,70 +689,166 @@
           <w:rFonts w:ascii="Aptos" w:eastAsia="Aptos" w:hAnsi="Aptos" w:cs="Aptos"/>
           <w:i/>
           <w:iCs/>
+          <w:color w:val="000000" w:themeColor="text1"/>
+          <w:lang w:val="es-MX"/>
+        </w:rPr>
+        <w:t xml:space="preserve">Java </w:t>
+      </w:r>
+      <w:proofErr w:type="spellStart"/>
+      <w:r>
+        <w:rPr>
+          <w:rFonts w:ascii="Aptos" w:eastAsia="Aptos" w:hAnsi="Aptos" w:cs="Aptos"/>
+          <w:i/>
+          <w:iCs/>
+          <w:color w:val="000000" w:themeColor="text1"/>
+          <w:lang w:val="es-MX"/>
+        </w:rPr>
+        <w:t>Platform</w:t>
+      </w:r>
+      <w:proofErr w:type="spellEnd"/>
+      <w:r>
+        <w:rPr>
+          <w:rFonts w:ascii="Aptos" w:eastAsia="Aptos" w:hAnsi="Aptos" w:cs="Aptos"/>
+          <w:i/>
+          <w:iCs/>
+          <w:color w:val="000000" w:themeColor="text1"/>
+          <w:lang w:val="es-MX"/>
+        </w:rPr>
+        <w:t xml:space="preserve">, Standard </w:t>
+      </w:r>
+      <w:proofErr w:type="spellStart"/>
+      <w:r>
+        <w:rPr>
+          <w:rFonts w:ascii="Aptos" w:eastAsia="Aptos" w:hAnsi="Aptos" w:cs="Aptos"/>
+          <w:i/>
+          <w:iCs/>
+          <w:color w:val="000000" w:themeColor="text1"/>
+          <w:lang w:val="es-MX"/>
+        </w:rPr>
+        <w:t>Edition</w:t>
+      </w:r>
+      <w:proofErr w:type="spellEnd"/>
+      <w:r>
+        <w:rPr>
+          <w:rFonts w:ascii="Aptos" w:eastAsia="Aptos" w:hAnsi="Aptos" w:cs="Aptos"/>
+          <w:i/>
+          <w:iCs/>
+          <w:color w:val="000000" w:themeColor="text1"/>
+          <w:lang w:val="es-MX"/>
+        </w:rPr>
+        <w:t xml:space="preserve"> </w:t>
+      </w:r>
+      <w:proofErr w:type="spellStart"/>
+      <w:r>
+        <w:rPr>
+          <w:rFonts w:ascii="Aptos" w:eastAsia="Aptos" w:hAnsi="Aptos" w:cs="Aptos"/>
+          <w:i/>
+          <w:iCs/>
+          <w:color w:val="000000" w:themeColor="text1"/>
+          <w:lang w:val="es-MX"/>
+        </w:rPr>
+        <w:t>Documentation</w:t>
+      </w:r>
+      <w:proofErr w:type="spellEnd"/>
+      <w:r>
+        <w:rPr>
+          <w:rFonts w:ascii="Aptos" w:eastAsia="Aptos" w:hAnsi="Aptos" w:cs="Aptos"/>
+          <w:color w:val="000000" w:themeColor="text1"/>
+          <w:lang w:val="es-MX"/>
+        </w:rPr>
+        <w:t xml:space="preserve">. Recuperado de </w:t>
+      </w:r>
+      <w:hyperlink r:id="rId5">
+        <w:r>
+          <w:rPr>
+            <w:rStyle w:val="Hipervnculo"/>
+            <w:color w:val="000000" w:themeColor="text1"/>
+            <w:lang w:val="es-MX"/>
+          </w:rPr>
+          <w:t>https://docs.oracle.com/en/java/</w:t>
+        </w:r>
+      </w:hyperlink>
+    </w:p>
+    <w:p>
+      <w:pPr>
+        <w:spacing w:before="240" w:after="240"/>
+        <w:rPr>
+          <w:color w:val="000000" w:themeColor="text1"/>
           <w:lang w:val="en-US"/>
         </w:rPr>
-        <w:t>Java Platform, Standard Edition Documentation</w:t>
-      </w:r>
-      <w:r>
-        <w:rPr>
-          <w:rFonts w:ascii="Aptos" w:eastAsia="Aptos" w:hAnsi="Aptos" w:cs="Aptos"/>
+      </w:pPr>
+      <w:r>
+        <w:rPr>
+          <w:color w:val="000000" w:themeColor="text1"/>
           <w:lang w:val="en-US"/>
         </w:rPr>
-        <w:t xml:space="preserve">. Recuperado de </w:t>
-      </w:r>
-      <w:hyperlink r:id="rId5">
+        <w:t>Barnes, D. J., &amp; Kölling, M. (2021). Objects first with Java: A practical introduction using BlueJ (7th ed.). Pearson.</w:t>
+      </w:r>
+    </w:p>
+    <w:p>
+      <w:pPr>
+        <w:spacing w:before="240" w:after="240"/>
+        <w:rPr>
+          <w:color w:val="000000" w:themeColor="text1"/>
+          <w:lang w:val="en-US"/>
+        </w:rPr>
+      </w:pPr>
+      <w:r>
+        <w:rPr>
+          <w:color w:val="000000" w:themeColor="text1"/>
+          <w:lang w:val="en-US"/>
+        </w:rPr>
+        <w:t>Beck, K., &amp; Andres, C. (2004). Extreme programming explained: Embrace change (2nd ed.). Addison-Wesley.</w:t>
+      </w:r>
+    </w:p>
+    <w:p>
+      <w:pPr>
+        <w:spacing w:before="240" w:after="240"/>
+        <w:rPr>
+          <w:lang w:val="en-US"/>
+        </w:rPr>
+      </w:pPr>
+      <w:r>
+        <w:rPr>
+          <w:color w:val="000000" w:themeColor="text1"/>
+          <w:lang w:val="en-US"/>
+        </w:rPr>
+        <w:t xml:space="preserve">Oracle. (s.f.). How to write doc comments for the Javadoc tool. Oracle Technology Network. </w:t>
+      </w:r>
+      <w:hyperlink r:id="rId6">
+        <w:r>
+          <w:rPr>
+            <w:rStyle w:val="Hipervnculo"/>
+            <w:color w:val="000000" w:themeColor="text1"/>
+            <w:lang w:val="en-US"/>
+          </w:rPr>
+          <w:t>https://www.oracle.com/technical-resources/articles/java/javadoc-tool.html</w:t>
+        </w:r>
+      </w:hyperlink>
+    </w:p>
+    <w:p>
+      <w:pPr>
+        <w:spacing w:before="240" w:after="240"/>
+        <w:rPr>
+          <w:lang w:val="en-US"/>
+        </w:rPr>
+      </w:pPr>
+      <w:r>
+        <w:rPr>
+          <w:color w:val="000000" w:themeColor="text1"/>
+          <w:lang w:val="en-US"/>
+        </w:rPr>
+        <w:t xml:space="preserve">Change Vision Inc. (s.f.). Astah Professional User's Guide, </w:t>
+      </w:r>
+      <w:hyperlink r:id="rId7">
         <w:r>
           <w:rPr>
             <w:rStyle w:val="Hipervnculo"/>
             <w:lang w:val="en-US"/>
           </w:rPr>
-          <w:t>https://docs.oracle.com/en/java/</w:t>
+          <w:t>https://astah.net/support/astah-pro/</w:t>
         </w:r>
       </w:hyperlink>
-    </w:p>
-    <w:p>
-      <w:pPr>
-        <w:spacing w:before="240" w:after="240"/>
-      </w:pPr>
-      <w:r>
-        <w:rPr>
-          <w:lang w:val="en-US"/>
-        </w:rPr>
-        <w:t>Barnes, D. J., &amp; Kölling, M. (2021). Objects first with Java: A practical introduction using BlueJ (7th ed.). Pearson.</w:t>
-      </w:r>
-    </w:p>
-    <w:p>
-      <w:pPr>
-        <w:spacing w:before="240" w:after="240"/>
-      </w:pPr>
-      <w:r>
-        <w:rPr>
-          <w:lang w:val="en-US"/>
-        </w:rPr>
-        <w:t>Beck, K., &amp; Andres, C. (2004). Extreme programming explained: Embrace change (2nd ed.). Addison-Wesley.</w:t>
-      </w:r>
-    </w:p>
-    <w:p>
-      <w:pPr>
-        <w:spacing w:before="240" w:after="240"/>
-      </w:pPr>
-      <w:r>
-        <w:rPr>
-          <w:lang w:val="en-US"/>
-        </w:rPr>
-        <w:t>Fowler, M. (2003). UML distilled: A brief guide to the standard object modeling language (3rd ed.). Addison-Wesley</w:t>
-      </w:r>
-    </w:p>
-    <w:p>
-      <w:pPr>
-        <w:spacing w:before="240" w:after="240"/>
-      </w:pPr>
-      <w:r>
-        <w:rPr>
-          <w:lang w:val="en-US"/>
-        </w:rPr>
-        <w:t>Oracle. (s.f.). How to write doc comments for the Javadoc tool. Oracle Technology Network. https://www.oracle.com/technical-resources/articles/java/javadoc-tool.html</w:t>
-      </w:r>
     </w:p>
     <w:sectPr>
       <w:pgSz w:w="11906" w:h="16838"/>
@@ -623,8 +865,8 @@
   <w:abstractNum w:abstractNumId="0" w15:restartNumberingAfterBreak="0">
     <w:nsid w:val="3EB3097E"/>
     <w:multiLevelType w:val="hybridMultilevel"/>
-    <w:tmpl w:val="DAD4823A"/>
-    <w:lvl w:ilvl="0" w:tplc="833E7A7C">
+    <w:tmpl w:val="FC32A6BA"/>
+    <w:lvl w:ilvl="0" w:tplc="9E2473D4">
       <w:start w:val="1"/>
       <w:numFmt w:val="bullet"/>
       <w:lvlText w:val=""/>
@@ -636,7 +878,7 @@
         <w:rFonts w:ascii="Symbol" w:hAnsi="Symbol" w:hint="default"/>
       </w:rPr>
     </w:lvl>
-    <w:lvl w:ilvl="1" w:tplc="678A8E1C">
+    <w:lvl w:ilvl="1" w:tplc="1D024272">
       <w:start w:val="1"/>
       <w:numFmt w:val="bullet"/>
       <w:lvlText w:val="o"/>
@@ -648,7 +890,7 @@
         <w:rFonts w:ascii="Courier New" w:hAnsi="Courier New" w:hint="default"/>
       </w:rPr>
     </w:lvl>
-    <w:lvl w:ilvl="2" w:tplc="4C9A05EC">
+    <w:lvl w:ilvl="2" w:tplc="648E39BC">
       <w:start w:val="1"/>
       <w:numFmt w:val="bullet"/>
       <w:lvlText w:val=""/>
@@ -660,7 +902,7 @@
         <w:rFonts w:ascii="Wingdings" w:hAnsi="Wingdings" w:hint="default"/>
       </w:rPr>
     </w:lvl>
-    <w:lvl w:ilvl="3" w:tplc="9050B8C6">
+    <w:lvl w:ilvl="3" w:tplc="5BE4B450">
       <w:start w:val="1"/>
       <w:numFmt w:val="bullet"/>
       <w:lvlText w:val=""/>
@@ -672,7 +914,7 @@
         <w:rFonts w:ascii="Symbol" w:hAnsi="Symbol" w:hint="default"/>
       </w:rPr>
     </w:lvl>
-    <w:lvl w:ilvl="4" w:tplc="2C90D764">
+    <w:lvl w:ilvl="4" w:tplc="E5AEF3DE">
       <w:start w:val="1"/>
       <w:numFmt w:val="bullet"/>
       <w:lvlText w:val="o"/>
@@ -684,7 +926,7 @@
         <w:rFonts w:ascii="Courier New" w:hAnsi="Courier New" w:hint="default"/>
       </w:rPr>
     </w:lvl>
-    <w:lvl w:ilvl="5" w:tplc="D4CA0434">
+    <w:lvl w:ilvl="5" w:tplc="18168980">
       <w:start w:val="1"/>
       <w:numFmt w:val="bullet"/>
       <w:lvlText w:val=""/>
@@ -696,7 +938,7 @@
         <w:rFonts w:ascii="Wingdings" w:hAnsi="Wingdings" w:hint="default"/>
       </w:rPr>
     </w:lvl>
-    <w:lvl w:ilvl="6" w:tplc="943EA0CA">
+    <w:lvl w:ilvl="6" w:tplc="6B0291C8">
       <w:start w:val="1"/>
       <w:numFmt w:val="bullet"/>
       <w:lvlText w:val=""/>
@@ -708,7 +950,7 @@
         <w:rFonts w:ascii="Symbol" w:hAnsi="Symbol" w:hint="default"/>
       </w:rPr>
     </w:lvl>
-    <w:lvl w:ilvl="7" w:tplc="CFE63D3E">
+    <w:lvl w:ilvl="7" w:tplc="0BCE43B6">
       <w:start w:val="1"/>
       <w:numFmt w:val="bullet"/>
       <w:lvlText w:val="o"/>
@@ -720,7 +962,7 @@
         <w:rFonts w:ascii="Courier New" w:hAnsi="Courier New" w:hint="default"/>
       </w:rPr>
     </w:lvl>
-    <w:lvl w:ilvl="8" w:tplc="C2BE94B2">
+    <w:lvl w:ilvl="8" w:tplc="FCCA64CA">
       <w:start w:val="1"/>
       <w:numFmt w:val="bullet"/>
       <w:lvlText w:val=""/>
@@ -733,7 +975,7 @@
       </w:rPr>
     </w:lvl>
   </w:abstractNum>
-  <w:num w:numId="1" w16cid:durableId="63994113">
+  <w:num w:numId="1" w16cid:durableId="2039578261">
     <w:abstractNumId w:val="0"/>
   </w:num>
 </w:numbering>

</xml_diff>

<commit_message>
Update cycle 2 log
</commit_message>
<xml_diff>
--- a/documentacion/Bitacora.docx
+++ b/documentacion/Bitacora.docx
@@ -390,7 +390,28 @@
           <w:rFonts w:ascii="Aptos" w:eastAsia="Aptos" w:hAnsi="Aptos" w:cs="Aptos"/>
           <w:color w:val="000000" w:themeColor="text1"/>
         </w:rPr>
-        <w:t xml:space="preserve">Nosotros como equipo creemos que el mayor logro que conseguimos fue el diseño delegado, la SlotMachine coordina, pero delega en cada Wheel el manejo de sus </w:t>
+        <w:t>Nosotros como equipo creemos que el mayor logro que conseguimos</w:t>
+      </w:r>
+      <w:r>
+        <w:rPr>
+          <w:rFonts w:ascii="Aptos" w:eastAsia="Aptos" w:hAnsi="Aptos" w:cs="Aptos"/>
+          <w:color w:val="000000" w:themeColor="text1"/>
+        </w:rPr>
+        <w:t xml:space="preserve"> durante este ciclo</w:t>
+      </w:r>
+      <w:r>
+        <w:rPr>
+          <w:rFonts w:ascii="Aptos" w:eastAsia="Aptos" w:hAnsi="Aptos" w:cs="Aptos"/>
+          <w:color w:val="000000" w:themeColor="text1"/>
+        </w:rPr>
+        <w:t xml:space="preserve"> fue </w:t>
+      </w:r>
+      <w:r>
+        <w:rPr>
+          <w:rFonts w:ascii="Aptos" w:eastAsia="Aptos" w:hAnsi="Aptos" w:cs="Aptos"/>
+          <w:color w:val="000000" w:themeColor="text1"/>
+        </w:rPr>
+        <w:t xml:space="preserve">escalar el ciclo 1 de manera satisfactoria incluyendo las cosas que se nos </w:t>
       </w:r>
       <w:r>
         <w:rPr>
@@ -398,7 +419,56 @@
           <w:color w:val="000000" w:themeColor="text1"/>
         </w:rPr>
         <w:lastRenderedPageBreak/>
-        <w:t>símbolos y su giro, los símbolos son compartidos entre todas las ruedas. Lograr que agregar o quitar un símbolo se propagara a todas las ruedas manteniendo la posición fija de cada símbolo fue el resultado más sólido del diseño</w:t>
+        <w:t>pidieron en el cicl</w:t>
+      </w:r>
+      <w:r>
+        <w:rPr>
+          <w:rFonts w:ascii="Aptos" w:eastAsia="Aptos" w:hAnsi="Aptos" w:cs="Aptos"/>
+          <w:color w:val="000000" w:themeColor="text1"/>
+        </w:rPr>
+        <w:t>o 2 sin necesidad de</w:t>
+      </w:r>
+      <w:r>
+        <w:rPr>
+          <w:rFonts w:ascii="Aptos" w:eastAsia="Aptos" w:hAnsi="Aptos" w:cs="Aptos"/>
+          <w:color w:val="000000" w:themeColor="text1"/>
+        </w:rPr>
+        <w:t xml:space="preserve"> realizar muchos cambios</w:t>
+      </w:r>
+      <w:r>
+        <w:rPr>
+          <w:rFonts w:ascii="Aptos" w:eastAsia="Aptos" w:hAnsi="Aptos" w:cs="Aptos"/>
+          <w:color w:val="000000" w:themeColor="text1"/>
+        </w:rPr>
+        <w:t xml:space="preserve"> </w:t>
+      </w:r>
+      <w:r>
+        <w:rPr>
+          <w:rFonts w:ascii="Aptos" w:eastAsia="Aptos" w:hAnsi="Aptos" w:cs="Aptos"/>
+          <w:color w:val="000000" w:themeColor="text1"/>
+        </w:rPr>
+        <w:t>dentro del</w:t>
+      </w:r>
+      <w:r>
+        <w:rPr>
+          <w:rFonts w:ascii="Aptos" w:eastAsia="Aptos" w:hAnsi="Aptos" w:cs="Aptos"/>
+          <w:color w:val="000000" w:themeColor="text1"/>
+        </w:rPr>
+        <w:t xml:space="preserve"> código</w:t>
+      </w:r>
+      <w:r>
+        <w:rPr>
+          <w:rFonts w:ascii="Aptos" w:eastAsia="Aptos" w:hAnsi="Aptos" w:cs="Aptos"/>
+          <w:color w:val="000000" w:themeColor="text1"/>
+        </w:rPr>
+        <w:t xml:space="preserve"> y los diagramas</w:t>
+      </w:r>
+      <w:r>
+        <w:rPr>
+          <w:rFonts w:ascii="Aptos" w:eastAsia="Aptos" w:hAnsi="Aptos" w:cs="Aptos"/>
+          <w:color w:val="000000" w:themeColor="text1"/>
+        </w:rPr>
+        <w:t>, lo que implica que en el ciclo 1 se hizo un buen diseño y desarrollo de este.</w:t>
       </w:r>
     </w:p>
     <w:p>
@@ -434,35 +504,245 @@
           <w:rFonts w:ascii="Aptos" w:eastAsia="Aptos" w:hAnsi="Aptos" w:cs="Aptos"/>
           <w:color w:val="000000" w:themeColor="text1"/>
         </w:rPr>
-        <w:t>El manejo de las posiciones fijas de los símbolos con huecos al permitir que un símbolo quedara en una ranura fija dejando ranuras vacías, el giro debía saltar solo entre ranuras ocupadas y varios métodos podían fallar con valores nulos, lo resolvimos usando un índice de "siguiente ocupada" para el giro, y haciendo que los métodos de consulta (</w:t>
-      </w:r>
-      <w:r>
-        <w:rPr>
-          <w:rFonts w:ascii="Consolas" w:eastAsia="Consolas" w:hAnsi="Consolas" w:cs="Consolas"/>
-          <w:color w:val="000000" w:themeColor="text1"/>
-        </w:rPr>
-        <w:t>contains</w:t>
-      </w:r>
-      <w:r>
-        <w:rPr>
-          <w:rFonts w:ascii="Aptos" w:eastAsia="Aptos" w:hAnsi="Aptos" w:cs="Aptos"/>
-          <w:color w:val="000000" w:themeColor="text1"/>
-        </w:rPr>
-        <w:t xml:space="preserve">, </w:t>
-      </w:r>
-      <w:r>
-        <w:rPr>
-          <w:rFonts w:ascii="Consolas" w:eastAsia="Consolas" w:hAnsi="Consolas" w:cs="Consolas"/>
-          <w:color w:val="000000" w:themeColor="text1"/>
-        </w:rPr>
-        <w:t>distinctSymbols</w:t>
-      </w:r>
-      <w:r>
-        <w:rPr>
-          <w:rFonts w:ascii="Aptos" w:eastAsia="Aptos" w:hAnsi="Aptos" w:cs="Aptos"/>
-          <w:color w:val="000000" w:themeColor="text1"/>
-        </w:rPr>
-        <w:t>, el redibujado) ignoraran las ranuras vacías.</w:t>
+        <w:t>Creemos que uno de los mayores retos que tuvimos durante este ciclo fue</w:t>
+      </w:r>
+      <w:r>
+        <w:rPr>
+          <w:rFonts w:ascii="Aptos" w:eastAsia="Aptos" w:hAnsi="Aptos" w:cs="Aptos"/>
+          <w:color w:val="000000" w:themeColor="text1"/>
+        </w:rPr>
+        <w:t xml:space="preserve"> diseñar e implementar </w:t>
+      </w:r>
+      <w:r>
+        <w:rPr>
+          <w:rFonts w:ascii="Aptos" w:eastAsia="Aptos" w:hAnsi="Aptos" w:cs="Aptos"/>
+          <w:color w:val="000000" w:themeColor="text1"/>
+        </w:rPr>
+        <w:t>el ciclo</w:t>
+      </w:r>
+      <w:r>
+        <w:rPr>
+          <w:rFonts w:ascii="Aptos" w:eastAsia="Aptos" w:hAnsi="Aptos" w:cs="Aptos"/>
+          <w:color w:val="000000" w:themeColor="text1"/>
+        </w:rPr>
+        <w:t xml:space="preserve"> 2, debido a que debíamos pensar en varias cosas antes de implementarlo</w:t>
+      </w:r>
+      <w:r>
+        <w:rPr>
+          <w:rFonts w:ascii="Aptos" w:eastAsia="Aptos" w:hAnsi="Aptos" w:cs="Aptos"/>
+          <w:color w:val="000000" w:themeColor="text1"/>
+        </w:rPr>
+        <w:t>s</w:t>
+      </w:r>
+      <w:r>
+        <w:rPr>
+          <w:rFonts w:ascii="Aptos" w:eastAsia="Aptos" w:hAnsi="Aptos" w:cs="Aptos"/>
+          <w:color w:val="000000" w:themeColor="text1"/>
+        </w:rPr>
+        <w:t xml:space="preserve"> al ciclo 1</w:t>
+      </w:r>
+      <w:r>
+        <w:rPr>
+          <w:rFonts w:ascii="Aptos" w:eastAsia="Aptos" w:hAnsi="Aptos" w:cs="Aptos"/>
+          <w:color w:val="000000" w:themeColor="text1"/>
+        </w:rPr>
+        <w:t xml:space="preserve">, para esto lo que hicimos fue pensar durante un tiempo el cómo implementaríamos los requisitos, sin que esto chocara con la </w:t>
+      </w:r>
+      <w:r>
+        <w:rPr>
+          <w:rFonts w:ascii="Aptos" w:eastAsia="Aptos" w:hAnsi="Aptos" w:cs="Aptos"/>
+          <w:color w:val="000000" w:themeColor="text1"/>
+        </w:rPr>
+        <w:t>lógica</w:t>
+      </w:r>
+      <w:r>
+        <w:rPr>
+          <w:rFonts w:ascii="Aptos" w:eastAsia="Aptos" w:hAnsi="Aptos" w:cs="Aptos"/>
+          <w:color w:val="000000" w:themeColor="text1"/>
+        </w:rPr>
+        <w:t xml:space="preserve"> ya hecha</w:t>
+      </w:r>
+      <w:r>
+        <w:rPr>
+          <w:rFonts w:ascii="Aptos" w:eastAsia="Aptos" w:hAnsi="Aptos" w:cs="Aptos"/>
+          <w:color w:val="000000" w:themeColor="text1"/>
+        </w:rPr>
+        <w:t xml:space="preserve">, así que empezamos </w:t>
+      </w:r>
+      <w:r>
+        <w:rPr>
+          <w:rFonts w:ascii="Aptos" w:eastAsia="Aptos" w:hAnsi="Aptos" w:cs="Aptos"/>
+          <w:color w:val="000000" w:themeColor="text1"/>
+        </w:rPr>
+        <w:t xml:space="preserve">por hacer una revisión a los </w:t>
+      </w:r>
+      <w:r>
+        <w:rPr>
+          <w:rFonts w:ascii="Aptos" w:eastAsia="Aptos" w:hAnsi="Aptos" w:cs="Aptos"/>
+          <w:color w:val="000000" w:themeColor="text1"/>
+        </w:rPr>
+        <w:t>métodos</w:t>
+      </w:r>
+      <w:r>
+        <w:rPr>
+          <w:rFonts w:ascii="Aptos" w:eastAsia="Aptos" w:hAnsi="Aptos" w:cs="Aptos"/>
+          <w:color w:val="000000" w:themeColor="text1"/>
+        </w:rPr>
+        <w:t xml:space="preserve"> ya implementados para verificar que </w:t>
+      </w:r>
+      <w:r>
+        <w:rPr>
+          <w:rFonts w:ascii="Aptos" w:eastAsia="Aptos" w:hAnsi="Aptos" w:cs="Aptos"/>
+          <w:color w:val="000000" w:themeColor="text1"/>
+        </w:rPr>
+        <w:t>podría</w:t>
+      </w:r>
+      <w:r>
+        <w:rPr>
+          <w:rFonts w:ascii="Aptos" w:eastAsia="Aptos" w:hAnsi="Aptos" w:cs="Aptos"/>
+          <w:color w:val="000000" w:themeColor="text1"/>
+        </w:rPr>
+        <w:t xml:space="preserve"> cambiar</w:t>
+      </w:r>
+      <w:r>
+        <w:rPr>
+          <w:rFonts w:ascii="Aptos" w:eastAsia="Aptos" w:hAnsi="Aptos" w:cs="Aptos"/>
+          <w:color w:val="000000" w:themeColor="text1"/>
+        </w:rPr>
+        <w:t xml:space="preserve"> añadiendo los requerimientos del ciclo 2</w:t>
+      </w:r>
+      <w:r>
+        <w:rPr>
+          <w:rFonts w:ascii="Aptos" w:eastAsia="Aptos" w:hAnsi="Aptos" w:cs="Aptos"/>
+          <w:color w:val="000000" w:themeColor="text1"/>
+        </w:rPr>
+        <w:t>, luego hicimos bocetos de los cambios</w:t>
+      </w:r>
+      <w:r>
+        <w:rPr>
+          <w:rFonts w:ascii="Aptos" w:eastAsia="Aptos" w:hAnsi="Aptos" w:cs="Aptos"/>
+          <w:color w:val="000000" w:themeColor="text1"/>
+        </w:rPr>
+        <w:t xml:space="preserve"> que </w:t>
+      </w:r>
+      <w:r>
+        <w:rPr>
+          <w:rFonts w:ascii="Aptos" w:eastAsia="Aptos" w:hAnsi="Aptos" w:cs="Aptos"/>
+          <w:color w:val="000000" w:themeColor="text1"/>
+        </w:rPr>
+        <w:t>podrían</w:t>
+      </w:r>
+      <w:r>
+        <w:rPr>
+          <w:rFonts w:ascii="Aptos" w:eastAsia="Aptos" w:hAnsi="Aptos" w:cs="Aptos"/>
+          <w:color w:val="000000" w:themeColor="text1"/>
+        </w:rPr>
+        <w:t xml:space="preserve"> suceder a </w:t>
+      </w:r>
+      <w:r>
+        <w:rPr>
+          <w:rFonts w:ascii="Aptos" w:eastAsia="Aptos" w:hAnsi="Aptos" w:cs="Aptos"/>
+          <w:color w:val="000000" w:themeColor="text1"/>
+        </w:rPr>
+        <w:t>través</w:t>
+      </w:r>
+      <w:r>
+        <w:rPr>
+          <w:rFonts w:ascii="Aptos" w:eastAsia="Aptos" w:hAnsi="Aptos" w:cs="Aptos"/>
+          <w:color w:val="000000" w:themeColor="text1"/>
+        </w:rPr>
+        <w:t xml:space="preserve"> de los diagramas de secuencias</w:t>
+      </w:r>
+      <w:r>
+        <w:rPr>
+          <w:rFonts w:ascii="Aptos" w:eastAsia="Aptos" w:hAnsi="Aptos" w:cs="Aptos"/>
+          <w:color w:val="000000" w:themeColor="text1"/>
+        </w:rPr>
+        <w:t xml:space="preserve"> y una vez </w:t>
+      </w:r>
+      <w:r>
+        <w:rPr>
+          <w:rFonts w:ascii="Aptos" w:eastAsia="Aptos" w:hAnsi="Aptos" w:cs="Aptos"/>
+          <w:color w:val="000000" w:themeColor="text1"/>
+        </w:rPr>
+        <w:t>conformes con los resultados</w:t>
+      </w:r>
+      <w:r>
+        <w:rPr>
+          <w:rFonts w:ascii="Aptos" w:eastAsia="Aptos" w:hAnsi="Aptos" w:cs="Aptos"/>
+          <w:color w:val="000000" w:themeColor="text1"/>
+        </w:rPr>
+        <w:t>,</w:t>
+      </w:r>
+      <w:r>
+        <w:rPr>
+          <w:rFonts w:ascii="Aptos" w:eastAsia="Aptos" w:hAnsi="Aptos" w:cs="Aptos"/>
+          <w:color w:val="000000" w:themeColor="text1"/>
+        </w:rPr>
+        <w:t xml:space="preserve"> </w:t>
+      </w:r>
+      <w:r>
+        <w:rPr>
+          <w:rFonts w:ascii="Aptos" w:eastAsia="Aptos" w:hAnsi="Aptos" w:cs="Aptos"/>
+          <w:color w:val="000000" w:themeColor="text1"/>
+        </w:rPr>
+        <w:t xml:space="preserve"> </w:t>
+      </w:r>
+      <w:r>
+        <w:rPr>
+          <w:rFonts w:ascii="Aptos" w:eastAsia="Aptos" w:hAnsi="Aptos" w:cs="Aptos"/>
+          <w:color w:val="000000" w:themeColor="text1"/>
+        </w:rPr>
+        <w:t>empezamos</w:t>
+      </w:r>
+      <w:r>
+        <w:rPr>
+          <w:rFonts w:ascii="Aptos" w:eastAsia="Aptos" w:hAnsi="Aptos" w:cs="Aptos"/>
+          <w:color w:val="000000" w:themeColor="text1"/>
+        </w:rPr>
+        <w:t xml:space="preserve"> a hacer el </w:t>
+      </w:r>
+      <w:r>
+        <w:rPr>
+          <w:rFonts w:ascii="Aptos" w:eastAsia="Aptos" w:hAnsi="Aptos" w:cs="Aptos"/>
+          <w:color w:val="000000" w:themeColor="text1"/>
+        </w:rPr>
+        <w:t>código</w:t>
+      </w:r>
+      <w:r>
+        <w:rPr>
+          <w:rFonts w:ascii="Aptos" w:eastAsia="Aptos" w:hAnsi="Aptos" w:cs="Aptos"/>
+          <w:color w:val="000000" w:themeColor="text1"/>
+        </w:rPr>
+        <w:t xml:space="preserve"> </w:t>
+      </w:r>
+      <w:r>
+        <w:rPr>
+          <w:rFonts w:ascii="Aptos" w:eastAsia="Aptos" w:hAnsi="Aptos" w:cs="Aptos"/>
+          <w:color w:val="000000" w:themeColor="text1"/>
+        </w:rPr>
+        <w:t>implementando</w:t>
+      </w:r>
+      <w:r>
+        <w:rPr>
+          <w:rFonts w:ascii="Aptos" w:eastAsia="Aptos" w:hAnsi="Aptos" w:cs="Aptos"/>
+          <w:color w:val="000000" w:themeColor="text1"/>
+        </w:rPr>
+        <w:t xml:space="preserve"> cada mini-ciclo</w:t>
+      </w:r>
+      <w:r>
+        <w:rPr>
+          <w:rFonts w:ascii="Aptos" w:eastAsia="Aptos" w:hAnsi="Aptos" w:cs="Aptos"/>
+          <w:color w:val="000000" w:themeColor="text1"/>
+        </w:rPr>
+        <w:t xml:space="preserve"> que planteamos</w:t>
+      </w:r>
+      <w:r>
+        <w:rPr>
+          <w:rFonts w:ascii="Aptos" w:eastAsia="Aptos" w:hAnsi="Aptos" w:cs="Aptos"/>
+          <w:color w:val="000000" w:themeColor="text1"/>
+        </w:rPr>
+        <w:t>.</w:t>
       </w:r>
     </w:p>
     <w:p>
@@ -611,13 +891,6 @@
           <w:rFonts w:ascii="Aptos" w:eastAsia="Aptos" w:hAnsi="Aptos" w:cs="Aptos"/>
           <w:color w:val="000000" w:themeColor="text1"/>
         </w:rPr>
-        <w:t xml:space="preserve"> procediamos a implementar</w:t>
-      </w:r>
-      <w:r>
-        <w:rPr>
-          <w:rFonts w:ascii="Aptos" w:eastAsia="Aptos" w:hAnsi="Aptos" w:cs="Aptos"/>
-          <w:color w:val="000000" w:themeColor="text1"/>
-        </w:rPr>
         <w:t xml:space="preserve"> </w:t>
       </w:r>
       <w:r>
@@ -625,6 +898,27 @@
           <w:rFonts w:ascii="Aptos" w:eastAsia="Aptos" w:hAnsi="Aptos" w:cs="Aptos"/>
           <w:color w:val="000000" w:themeColor="text1"/>
         </w:rPr>
+        <w:t>procedíamos</w:t>
+      </w:r>
+      <w:r>
+        <w:rPr>
+          <w:rFonts w:ascii="Aptos" w:eastAsia="Aptos" w:hAnsi="Aptos" w:cs="Aptos"/>
+          <w:color w:val="000000" w:themeColor="text1"/>
+        </w:rPr>
+        <w:t xml:space="preserve"> a implementar</w:t>
+      </w:r>
+      <w:r>
+        <w:rPr>
+          <w:rFonts w:ascii="Aptos" w:eastAsia="Aptos" w:hAnsi="Aptos" w:cs="Aptos"/>
+          <w:color w:val="000000" w:themeColor="text1"/>
+        </w:rPr>
+        <w:t xml:space="preserve"> </w:t>
+      </w:r>
+      <w:r>
+        <w:rPr>
+          <w:rFonts w:ascii="Aptos" w:eastAsia="Aptos" w:hAnsi="Aptos" w:cs="Aptos"/>
+          <w:color w:val="000000" w:themeColor="text1"/>
+        </w:rPr>
         <w:t>e</w:t>
       </w:r>
       <w:r>
@@ -646,7 +940,35 @@
           <w:rFonts w:ascii="Aptos" w:eastAsia="Aptos" w:hAnsi="Aptos" w:cs="Aptos"/>
           <w:color w:val="000000" w:themeColor="text1"/>
         </w:rPr>
-        <w:t>, en el caso contrario de que las pruebas fallaran, se indagaba la fuente del error, se refactorizaba el codigo y se volvia a probar.</w:t>
+        <w:t xml:space="preserve">, en el caso contrario de que las pruebas fallaran, se indagaba la fuente del error, se refactorizaba el </w:t>
+      </w:r>
+      <w:r>
+        <w:rPr>
+          <w:rFonts w:ascii="Aptos" w:eastAsia="Aptos" w:hAnsi="Aptos" w:cs="Aptos"/>
+          <w:color w:val="000000" w:themeColor="text1"/>
+        </w:rPr>
+        <w:t>código</w:t>
+      </w:r>
+      <w:r>
+        <w:rPr>
+          <w:rFonts w:ascii="Aptos" w:eastAsia="Aptos" w:hAnsi="Aptos" w:cs="Aptos"/>
+          <w:color w:val="000000" w:themeColor="text1"/>
+        </w:rPr>
+        <w:t xml:space="preserve"> y se </w:t>
+      </w:r>
+      <w:r>
+        <w:rPr>
+          <w:rFonts w:ascii="Aptos" w:eastAsia="Aptos" w:hAnsi="Aptos" w:cs="Aptos"/>
+          <w:color w:val="000000" w:themeColor="text1"/>
+        </w:rPr>
+        <w:t>volvía</w:t>
+      </w:r>
+      <w:r>
+        <w:rPr>
+          <w:rFonts w:ascii="Aptos" w:eastAsia="Aptos" w:hAnsi="Aptos" w:cs="Aptos"/>
+          <w:color w:val="000000" w:themeColor="text1"/>
+        </w:rPr>
+        <w:t xml:space="preserve"> a probar.</w:t>
       </w:r>
     </w:p>
     <w:p>
@@ -865,8 +1187,8 @@
   <w:abstractNum w:abstractNumId="0" w15:restartNumberingAfterBreak="0">
     <w:nsid w:val="3EB3097E"/>
     <w:multiLevelType w:val="hybridMultilevel"/>
-    <w:tmpl w:val="FC32A6BA"/>
-    <w:lvl w:ilvl="0" w:tplc="9E2473D4">
+    <w:tmpl w:val="B308C55C"/>
+    <w:lvl w:ilvl="0" w:tplc="10304086">
       <w:start w:val="1"/>
       <w:numFmt w:val="bullet"/>
       <w:lvlText w:val=""/>
@@ -878,7 +1200,7 @@
         <w:rFonts w:ascii="Symbol" w:hAnsi="Symbol" w:hint="default"/>
       </w:rPr>
     </w:lvl>
-    <w:lvl w:ilvl="1" w:tplc="1D024272">
+    <w:lvl w:ilvl="1" w:tplc="D172BF08">
       <w:start w:val="1"/>
       <w:numFmt w:val="bullet"/>
       <w:lvlText w:val="o"/>
@@ -890,7 +1212,7 @@
         <w:rFonts w:ascii="Courier New" w:hAnsi="Courier New" w:hint="default"/>
       </w:rPr>
     </w:lvl>
-    <w:lvl w:ilvl="2" w:tplc="648E39BC">
+    <w:lvl w:ilvl="2" w:tplc="4F20F600">
       <w:start w:val="1"/>
       <w:numFmt w:val="bullet"/>
       <w:lvlText w:val=""/>
@@ -902,7 +1224,7 @@
         <w:rFonts w:ascii="Wingdings" w:hAnsi="Wingdings" w:hint="default"/>
       </w:rPr>
     </w:lvl>
-    <w:lvl w:ilvl="3" w:tplc="5BE4B450">
+    <w:lvl w:ilvl="3" w:tplc="F5242B2C">
       <w:start w:val="1"/>
       <w:numFmt w:val="bullet"/>
       <w:lvlText w:val=""/>
@@ -914,7 +1236,7 @@
         <w:rFonts w:ascii="Symbol" w:hAnsi="Symbol" w:hint="default"/>
       </w:rPr>
     </w:lvl>
-    <w:lvl w:ilvl="4" w:tplc="E5AEF3DE">
+    <w:lvl w:ilvl="4" w:tplc="BE4AD11C">
       <w:start w:val="1"/>
       <w:numFmt w:val="bullet"/>
       <w:lvlText w:val="o"/>
@@ -926,7 +1248,7 @@
         <w:rFonts w:ascii="Courier New" w:hAnsi="Courier New" w:hint="default"/>
       </w:rPr>
     </w:lvl>
-    <w:lvl w:ilvl="5" w:tplc="18168980">
+    <w:lvl w:ilvl="5" w:tplc="A44ED9AE">
       <w:start w:val="1"/>
       <w:numFmt w:val="bullet"/>
       <w:lvlText w:val=""/>
@@ -938,7 +1260,7 @@
         <w:rFonts w:ascii="Wingdings" w:hAnsi="Wingdings" w:hint="default"/>
       </w:rPr>
     </w:lvl>
-    <w:lvl w:ilvl="6" w:tplc="6B0291C8">
+    <w:lvl w:ilvl="6" w:tplc="822A256E">
       <w:start w:val="1"/>
       <w:numFmt w:val="bullet"/>
       <w:lvlText w:val=""/>
@@ -950,7 +1272,7 @@
         <w:rFonts w:ascii="Symbol" w:hAnsi="Symbol" w:hint="default"/>
       </w:rPr>
     </w:lvl>
-    <w:lvl w:ilvl="7" w:tplc="0BCE43B6">
+    <w:lvl w:ilvl="7" w:tplc="722464BA">
       <w:start w:val="1"/>
       <w:numFmt w:val="bullet"/>
       <w:lvlText w:val="o"/>
@@ -962,7 +1284,7 @@
         <w:rFonts w:ascii="Courier New" w:hAnsi="Courier New" w:hint="default"/>
       </w:rPr>
     </w:lvl>
-    <w:lvl w:ilvl="8" w:tplc="FCCA64CA">
+    <w:lvl w:ilvl="8" w:tplc="A81A862E">
       <w:start w:val="1"/>
       <w:numFmt w:val="bullet"/>
       <w:lvlText w:val=""/>
@@ -975,7 +1297,7 @@
       </w:rPr>
     </w:lvl>
   </w:abstractNum>
-  <w:num w:numId="1" w16cid:durableId="2039578261">
+  <w:num w:numId="1" w16cid:durableId="1188522832">
     <w:abstractNumId w:val="0"/>
   </w:num>
 </w:numbering>

</xml_diff>